<commit_message>
Emílio Santiago: parte 1 ajustada ao prompt mestre
Co-Authored-By: Claude Opus 5.5 <noreply@anthropic.com>
Claude-Session: https://claude.ai/code/session_01MJjUEEZrxQDEUifKK2vj9g
</commit_message>
<xml_diff>
--- a/roteiros/emilio-santiago/EmilioSantiago_Parte1_Introducao.docx
+++ b/roteiros/emilio-santiago/EmilioSantiago_Parte1_Introducao.docx
@@ -23,7 +23,7 @@
         <w:rPr>
           <w:color w:val="C00000"/>
         </w:rPr>
-        <w:t>O que pouca gente sabe é que, depois da morte, esse segredo foi parar na Justiça. E a briga chegou a um ponto que ninguém imaginava. Abriram o túmulo dele.</w:t>
+        <w:t>O que pouca gente sabe é que, depois da morte, esse segredo virou uma guerra suja na Justiça. Uma briga tão brutal que abriram o túmulo dele.</w:t>
       </w:r>
     </w:p>
     <w:p>
@@ -31,7 +31,7 @@
         <w:rPr>
           <w:color w:val="C00000"/>
         </w:rPr>
-        <w:t>Fique até o final, porque você vai descobrir quem estava de cada lado dessa guerra. E o resultado que saiu, dez anos depois, de dentro daquele caixão.</w:t>
+        <w:t>Fique até o final, porque você vai descobrir quem estava de cada lado dessa guerra. E o resultado arrepiante que saiu, dez anos depois, de dentro daquele caixão.</w:t>
       </w:r>
     </w:p>
     <w:p>
@@ -95,7 +95,31 @@
         <w:rPr>
           <w:color w:val="000000"/>
         </w:rPr>
-        <w:t>O Brasil chorou a voz das "Aquarelas Brasileiras". Os jornais lembraram os milhões de discos e as temporadas em Nova York. Os amigos da música foram se despedir.</w:t>
+        <w:t>O Brasil chorou a voz das "Aquarelas Brasileiras". Os jornais lembraram os milhões de discos e as temporadas em Nova York.</w:t>
+      </w:r>
+    </w:p>
+    <w:p>
+      <w:r>
+        <w:rPr>
+          <w:color w:val="000000"/>
+        </w:rPr>
+        <w:t>O corpo foi velado na Câmara de Vereadores do Rio. No dia seguinte, por volta de meio-dia e meia, foi enterrado no cemitério Memorial do Carmo, no Caju, Zona Portuária da cidade.</w:t>
+      </w:r>
+    </w:p>
+    <w:p>
+      <w:r>
+        <w:rPr>
+          <w:color w:val="000000"/>
+        </w:rPr>
+        <w:t>Cerca de cento e cinquenta pessoas estavam lá. Carlinhos Brown. Agnaldo Timóteo. O ator Tony Tornado. Numa capela, o público cantou "Saigon", enquanto um saxofonista acompanhava e as imagens de Emílio passavam num telão.</w:t>
+      </w:r>
+    </w:p>
+    <w:p>
+      <w:r>
+        <w:rPr>
+          <w:color w:val="000000"/>
+        </w:rPr>
+        <w:t>Guarde esse túmulo no Caju. Ele parecia o ponto final de uma vida. Anos depois, ia virar o centro de uma das disputas mais sombrias da música brasileira.</w:t>
       </w:r>
     </w:p>
     <w:p>

</xml_diff>

<commit_message>
Emílio Santiago: revisão parte 1
Co-Authored-By: Claude Opus 5.5 <noreply@anthropic.com>
Claude-Session: https://claude.ai/code/session_01MJjUEEZrxQDEUifKK2vj9g
</commit_message>
<xml_diff>
--- a/roteiros/emilio-santiago/EmilioSantiago_Parte1_Introducao.docx
+++ b/roteiros/emilio-santiago/EmilioSantiago_Parte1_Introducao.docx
@@ -47,7 +47,7 @@
         <w:rPr>
           <w:color w:val="000000"/>
         </w:rPr>
-        <w:t>No palco do Teatro Net Rio, em Copacabana, Emílio Santiago cantava o show "Só Danço Samba". Tinha sessenta e seis anos e quatro décadas de carreira. A voz continuava intacta.</w:t>
+        <w:t>No palco do Teatro Net Rio, em Copacabana, Emílio Santiago cantava o show "Só Danço Samba". Tinha sessenta e seis anos e quatro décadas de carreira.</w:t>
       </w:r>
     </w:p>
     <w:p>
@@ -55,15 +55,7 @@
         <w:rPr>
           <w:color w:val="000000"/>
         </w:rPr>
-        <w:t>A plateia aplaudia de pé um dos maiores intérpretes da música brasileira.</w:t>
-      </w:r>
-    </w:p>
-    <w:p>
-      <w:r>
-        <w:rPr>
-          <w:color w:val="000000"/>
-        </w:rPr>
-        <w:t>Ninguém ali sabia que estava assistindo a um dos últimos shows da vida dele.</w:t>
+        <w:t>Ninguém na plateia sabia que estava assistindo a um dos últimos shows da vida dele.</w:t>
       </w:r>
     </w:p>
     <w:p>
@@ -111,7 +103,7 @@
         <w:rPr>
           <w:color w:val="000000"/>
         </w:rPr>
-        <w:t>Cerca de cento e cinquenta pessoas estavam lá. Carlinhos Brown. Agnaldo Timóteo. O ator Tony Tornado. Numa capela, o público cantou "Saigon", enquanto um saxofonista acompanhava e as imagens de Emílio passavam num telão.</w:t>
+        <w:t>Cerca de cento e cinquenta pessoas estavam lá, entre elas Carlinhos Brown e Agnaldo Timóteo. Numa capela, o público cantou "Saigon", enquanto um saxofonista acompanhava e as imagens de Emílio passavam num telão.</w:t>
       </w:r>
     </w:p>
     <w:p>
@@ -199,7 +191,7 @@
         <w:rPr>
           <w:color w:val="000000"/>
         </w:rPr>
-        <w:t>O pai existia. Mas formou outra família, onde nasceu pelo menos uma filha.</w:t>
+        <w:t>O pai, Mário Santiago, formou outra família. Nela nasceu pelo menos uma filha, dez anos mais nova que Emílio.</w:t>
       </w:r>
     </w:p>
     <w:p>
@@ -255,14 +247,6 @@
         <w:rPr>
           <w:color w:val="000000"/>
         </w:rPr>
-        <w:t>O destino, porém, tinha outros planos.</w:t>
-      </w:r>
-    </w:p>
-    <w:p>
-      <w:r>
-        <w:rPr>
-          <w:color w:val="000000"/>
-        </w:rPr>
         <w:t>A faculdade abriu inscrições para um festival de música. Os amigos de Emílio conheciam a voz dele. E fizeram uma coisa sem avisar.</w:t>
       </w:r>
     </w:p>
@@ -303,7 +287,7 @@
         <w:rPr>
           <w:color w:val="000000"/>
         </w:rPr>
-        <w:t>Mesmo assim, terminou o curso de Direito, por insistência dos pais.</w:t>
+        <w:t>Mesmo assim, terminou o curso de Direito, por insistência da família.</w:t>
       </w:r>
     </w:p>
     <w:p>
@@ -335,7 +319,7 @@
         <w:rPr>
           <w:color w:val="000000"/>
         </w:rPr>
-        <w:t>Emílio passou pela prova.</w:t>
+        <w:t>Emílio encarou aquele júri e seguiu em frente.</w:t>
       </w:r>
     </w:p>
     <w:p>

</xml_diff>

<commit_message>
Emílio Santiago: roteiro ampliado, auditoria e pacote; corrige pacote da Maitê
Co-Authored-By: Claude Opus 5.5 <noreply@anthropic.com>
Claude-Session: https://claude.ai/code/session_01MJjUEEZrxQDEUifKK2vj9g
</commit_message>
<xml_diff>
--- a/roteiros/emilio-santiago/EmilioSantiago_Parte1_Introducao.docx
+++ b/roteiros/emilio-santiago/EmilioSantiago_Parte1_Introducao.docx
@@ -63,6 +63,22 @@
         <w:rPr>
           <w:color w:val="000000"/>
         </w:rPr>
+        <w:t>A agenda de março estava cheia. Dia treze, Campinas. Dia dezesseis, a quadra da Portela, no Rio. Dias vinte e dois e vinte e três, São Paulo.</w:t>
+      </w:r>
+    </w:p>
+    <w:p>
+      <w:r>
+        <w:rPr>
+          <w:color w:val="000000"/>
+        </w:rPr>
+        <w:t>Emílio não chegou a nenhum desses palcos.</w:t>
+      </w:r>
+    </w:p>
+    <w:p>
+      <w:r>
+        <w:rPr>
+          <w:color w:val="000000"/>
+        </w:rPr>
         <w:t>No dia sete de março, Emílio sofreu um acidente vascular cerebral. Foi levado para o Hospital Samaritano, na Zona Sul do Rio.</w:t>
       </w:r>
     </w:p>
@@ -80,6 +96,14 @@
           <w:color w:val="000000"/>
         </w:rPr>
         <w:t>Na manhã do dia vinte de março, morreu.</w:t>
+      </w:r>
+    </w:p>
+    <w:p>
+      <w:r>
+        <w:rPr>
+          <w:color w:val="000000"/>
+        </w:rPr>
+        <w:t>A notícia correu entre os músicos em poucas horas. Ed Motta escreveu: "O maior cantor do Brasil Emilio Santiago partiu para o plano espiritual. Que tristeza meu Deus."</w:t>
       </w:r>
     </w:p>
     <w:p>
@@ -223,7 +247,7 @@
         <w:rPr>
           <w:color w:val="000000"/>
         </w:rPr>
-        <w:t>A música ainda não era o plano. O plano era outro, e dizia muito sobre quem ele era.</w:t>
+        <w:t>Naquela época, o plano de Emílio passava longe da música. E dizia muito sobre quem ele era.</w:t>
       </w:r>
     </w:p>
     <w:p>
@@ -232,6 +256,14 @@
           <w:color w:val="000000"/>
         </w:rPr>
         <w:t>Ao longo do curso, Emílio passou a sonhar com a carreira de diplomata. Havia um motivo por trás disso. Incomodava a ele que não existissem negros nos quadros do Itamaraty.</w:t>
+      </w:r>
+    </w:p>
+    <w:p>
+      <w:r>
+        <w:rPr>
+          <w:color w:val="000000"/>
+        </w:rPr>
+        <w:t>Muitos anos depois, no programa de Fátima Bernardes, ele explicou como aquilo nasceu: "Você cresce e toma consciência das coisas. Comecei a perceber que não havia diplomatas negros."</w:t>
       </w:r>
     </w:p>
     <w:p>
@@ -343,7 +375,7 @@
         <w:rPr>
           <w:color w:val="000000"/>
         </w:rPr>
-        <w:t>Dois anos depois, em mil novecentos e setenta e cinco, veio o primeiro LP. O título era simplesmente o nome dele. "Emílio Santiago".</w:t>
+        <w:t>Dois anos depois, em mil novecentos e setenta e cinco, veio o primeiro LP. O título era simplesmente o nome dele. "Emílio Santiago". No repertório, músicas de Ivan Lins e Jorge Ben Jor, entre outros.</w:t>
       </w:r>
     </w:p>
     <w:p>

</xml_diff>

<commit_message>
Emílio Santiago: auditoria final de retenção e anti-IA
Co-Authored-By: Claude Opus 5.5 <noreply@anthropic.com>
Claude-Session: https://claude.ai/code/session_01MJjUEEZrxQDEUifKK2vj9g
</commit_message>
<xml_diff>
--- a/roteiros/emilio-santiago/EmilioSantiago_Parte1_Introducao.docx
+++ b/roteiros/emilio-santiago/EmilioSantiago_Parte1_Introducao.docx
@@ -303,7 +303,7 @@
         <w:rPr>
           <w:color w:val="000000"/>
         </w:rPr>
-        <w:t>Entre os jurados estava uma cantora que, anos depois, ia virar uma das maiores vozes do samba. Beth Carvalho.</w:t>
+        <w:t>Entre os jurados estava uma cantora que ia virar uma das maiores vozes do samba. Beth Carvalho.</w:t>
       </w:r>
     </w:p>
     <w:p>
@@ -391,7 +391,7 @@
         <w:rPr>
           <w:color w:val="000000"/>
         </w:rPr>
-        <w:t>Só que, enquanto a carreira subia, a vida pessoal de Emílio ia ficando cada vez mais fechada. Ele falava de música com prazer. Sobre a própria intimidade, quase nada.</w:t>
+        <w:t>Só que, enquanto a carreira subia, a vida pessoal de Emílio ia ficando cada vez mais fechada.</w:t>
       </w:r>
     </w:p>
     <w:p>

</xml_diff>